<commit_message>
Atualização do código e dos modelos
</commit_message>
<xml_diff>
--- a/Modelos/ACT/celeb_act.docx
+++ b/Modelos/ACT/celeb_act.docx
@@ -248,8 +248,6 @@
       <w:r>
         <w:t>”</w:t>
       </w:r>
-      <w:bookmarkStart w:id="0" w:name="_GoBack"/>
-      <w:bookmarkEnd w:id="0"/>
     </w:p>
     <w:p>
       <w:pPr>
@@ -954,21 +952,34 @@
         <w:ind w:left="0" w:hanging="2"/>
         <w:jc w:val="right"/>
       </w:pPr>
-      <w:proofErr w:type="gramStart"/>
+      <w:r>
+        <w:t>COORDENADOR DO PROJETO</w:t>
+      </w:r>
+      <w:r>
+        <w:br/>
+        <w:t xml:space="preserve">NOME: </w:t>
+      </w:r>
       <w:r>
         <w:t xml:space="preserve">{{ </w:t>
       </w:r>
       <w:proofErr w:type="spellStart"/>
       <w:r>
-        <w:t>nome</w:t>
-      </w:r>
-      <w:proofErr w:type="gramEnd"/>
-      <w:r>
-        <w:t>_coord</w:t>
+        <w:t>nome_coord</w:t>
       </w:r>
       <w:proofErr w:type="spellEnd"/>
       <w:r>
-        <w:t xml:space="preserve"> }}  {{ </w:t>
+        <w:t xml:space="preserve"> }}  </w:t>
+      </w:r>
+      <w:r>
+        <w:br/>
+      </w:r>
+      <w:bookmarkStart w:id="0" w:name="_GoBack"/>
+      <w:bookmarkEnd w:id="0"/>
+      <w:r>
+        <w:t xml:space="preserve">SIAPE: </w:t>
+      </w:r>
+      <w:r>
+        <w:t xml:space="preserve">{{ </w:t>
       </w:r>
       <w:proofErr w:type="spellStart"/>
       <w:r>

</xml_diff>